<commit_message>
fix(templates): improve docx field extraction logic
Prevent tall form fields (signature, image, stamp, initials, file) in table
cells from overlapping visible labels above them. LibreOffice can collapse
empty paragraphs, causing fields to render over text. This change pushes
such fields down to ensure labels remain readable.

Additionally, refine the tag matching logic to ensure that short field names
do not incorrectly match longer field names that share a prefix. This is
done by validating the character immediately following the field name.
</commit_message>
<xml_diff>
--- a/docs/samples/template_kopsyarx.docx
+++ b/docs/samples/template_kopsyarx.docx
@@ -2111,33 +2111,13 @@
           <w:p>
             <w:pPr>
               <w:jc w:val="center"/>
-            </w:pPr>
-            <w:r>
               <w:rPr>
                 <w:b/>
                 <w:bCs/>
                 <w:lang w:val="en-US"/>
               </w:rPr>
-              <w:t>Persetujuan Pemohon</w:t>
-            </w:r>
-          </w:p>
-        </w:tc>
-        <w:tc>
-          <w:tcPr>
-            <w:tcW w:w="4960" w:type="dxa"/>
-            <w:tcBorders>
-              <w:top w:val="none" w:sz="0" w:space="0" w:color="FFFFFF"/>
-              <w:left w:val="none" w:sz="0" w:space="0" w:color="FFFFFF"/>
-              <w:bottom w:val="none" w:sz="0" w:space="0" w:color="FFFFFF"/>
-              <w:right w:val="none" w:sz="0" w:space="0" w:color="FFFFFF"/>
-            </w:tcBorders>
-            <w:tcMar>
-              <w:top w:w="40" w:type="dxa"/>
-              <w:left w:w="80" w:type="dxa"/>
-              <w:bottom w:w="40" w:type="dxa"/>
-              <w:right w:w="80" w:type="dxa"/>
-            </w:tcMar>
-          </w:tcPr>
+            </w:pPr>
+          </w:p>
           <w:p>
             <w:pPr>
               <w:jc w:val="center"/>
@@ -2149,53 +2129,30 @@
             </w:pPr>
             <w:r>
               <w:rPr>
-                <w:lang w:val="en-US"/>
-              </w:rPr>
-              <w:t>{{</w:t>
-            </w:r>
-            <w:proofErr w:type="gramStart"/>
-            <w:r>
-              <w:rPr>
-                <w:lang w:val="en-US"/>
-              </w:rPr>
-              <w:t>Tg;type</w:t>
-            </w:r>
-            <w:proofErr w:type="gramEnd"/>
-            <w:r>
-              <w:rPr>
-                <w:lang w:val="en-US"/>
-              </w:rPr>
-              <w:t>=</w:t>
-            </w:r>
-            <w:proofErr w:type="gramStart"/>
-            <w:r>
-              <w:rPr>
-                <w:lang w:val="en-US"/>
-              </w:rPr>
-              <w:t>date;role</w:t>
-            </w:r>
-            <w:proofErr w:type="gramEnd"/>
-            <w:r>
-              <w:rPr>
-                <w:lang w:val="en-US"/>
-              </w:rPr>
-              <w:t>=</w:t>
-            </w:r>
-            <w:proofErr w:type="gramStart"/>
-            <w:r>
-              <w:rPr>
-                <w:lang w:val="en-US"/>
-              </w:rPr>
-              <w:t>Petugas;format</w:t>
-            </w:r>
-            <w:proofErr w:type="gramEnd"/>
-            <w:r>
-              <w:rPr>
-                <w:lang w:val="en-US"/>
-              </w:rPr>
-              <w:t>=DD/MM/YYYY}}</w:t>
-            </w:r>
-          </w:p>
+                <w:b/>
+                <w:bCs/>
+                <w:lang w:val="en-US"/>
+              </w:rPr>
+              <w:t>Persetujuan Pemohon</w:t>
+            </w:r>
+          </w:p>
+        </w:tc>
+        <w:tc>
+          <w:tcPr>
+            <w:tcW w:w="4960" w:type="dxa"/>
+            <w:tcBorders>
+              <w:top w:val="none" w:sz="0" w:space="0" w:color="FFFFFF"/>
+              <w:left w:val="none" w:sz="0" w:space="0" w:color="FFFFFF"/>
+              <w:bottom w:val="none" w:sz="0" w:space="0" w:color="FFFFFF"/>
+              <w:right w:val="none" w:sz="0" w:space="0" w:color="FFFFFF"/>
+            </w:tcBorders>
+            <w:tcMar>
+              <w:top w:w="40" w:type="dxa"/>
+              <w:left w:w="80" w:type="dxa"/>
+              <w:bottom w:w="40" w:type="dxa"/>
+              <w:right w:w="80" w:type="dxa"/>
+            </w:tcMar>
+          </w:tcPr>
           <w:p>
             <w:pPr>
               <w:jc w:val="center"/>
@@ -2205,10 +2162,73 @@
                 <w:lang w:val="en-US"/>
               </w:rPr>
             </w:pPr>
+            <w:r>
+              <w:rPr>
+                <w:lang w:val="en-US"/>
+              </w:rPr>
+              <w:t>{{</w:t>
+            </w:r>
+            <w:proofErr w:type="gramStart"/>
+            <w:r>
+              <w:rPr>
+                <w:lang w:val="en-US"/>
+              </w:rPr>
+              <w:t>Tg;type</w:t>
+            </w:r>
+            <w:proofErr w:type="gramEnd"/>
+            <w:r>
+              <w:rPr>
+                <w:lang w:val="en-US"/>
+              </w:rPr>
+              <w:t>=</w:t>
+            </w:r>
+            <w:proofErr w:type="gramStart"/>
+            <w:r>
+              <w:rPr>
+                <w:lang w:val="en-US"/>
+              </w:rPr>
+              <w:t>date;role</w:t>
+            </w:r>
+            <w:proofErr w:type="gramEnd"/>
+            <w:r>
+              <w:rPr>
+                <w:lang w:val="en-US"/>
+              </w:rPr>
+              <w:t>=</w:t>
+            </w:r>
+            <w:proofErr w:type="gramStart"/>
+            <w:r>
+              <w:rPr>
+                <w:lang w:val="en-US"/>
+              </w:rPr>
+              <w:t>Petugas;format</w:t>
+            </w:r>
+            <w:proofErr w:type="gramEnd"/>
+            <w:r>
+              <w:rPr>
+                <w:lang w:val="en-US"/>
+              </w:rPr>
+              <w:t>=DD/MM/YYYY}}</w:t>
+            </w:r>
           </w:p>
           <w:p>
             <w:pPr>
               <w:jc w:val="center"/>
+              <w:rPr>
+                <w:b/>
+                <w:bCs/>
+                <w:lang w:val="en-US"/>
+              </w:rPr>
+            </w:pPr>
+          </w:p>
+          <w:p>
+            <w:pPr>
+              <w:jc w:val="center"/>
+              <w:rPr>
+                <w:b/>
+                <w:bCs/>
+                <w:lang w:val="en-US"/>
+              </w:rPr>
             </w:pPr>
             <w:r>
               <w:rPr>
@@ -2228,6 +2248,9 @@
             <w:bottom w:w="0" w:type="dxa"/>
           </w:tblCellMar>
         </w:tblPrEx>
+        <w:trPr>
+          <w:trHeight w:val="1172"/>
+        </w:trPr>
         <w:tc>
           <w:tcPr>
             <w:tcW w:w="4678" w:type="dxa"/>
@@ -2249,17 +2272,111 @@
               <w:spacing w:before="60" w:after="60"/>
               <w:jc w:val="center"/>
               <w:rPr>
-                <w:lang w:val="en-US"/>
+                <w:sz w:val="16"/>
+                <w:szCs w:val="16"/>
               </w:rPr>
             </w:pPr>
-          </w:p>
+            <w:r>
+              <w:rPr>
+                <w:sz w:val="16"/>
+                <w:szCs w:val="16"/>
+                <w:lang w:val="en-US"/>
+              </w:rPr>
+              <w:t>{{</w:t>
+            </w:r>
+            <w:proofErr w:type="gramStart"/>
+            <w:r>
+              <w:rPr>
+                <w:sz w:val="16"/>
+                <w:szCs w:val="16"/>
+                <w:lang w:val="en-US"/>
+              </w:rPr>
+              <w:t>SPE</w:t>
+            </w:r>
+            <w:r>
+              <w:rPr>
+                <w:sz w:val="16"/>
+                <w:szCs w:val="16"/>
+                <w:lang w:val="en-US"/>
+              </w:rPr>
+              <w:t>;type</w:t>
+            </w:r>
+            <w:proofErr w:type="gramEnd"/>
+            <w:r>
+              <w:rPr>
+                <w:sz w:val="16"/>
+                <w:szCs w:val="16"/>
+                <w:lang w:val="en-US"/>
+              </w:rPr>
+              <w:t>=</w:t>
+            </w:r>
+            <w:proofErr w:type="gramStart"/>
+            <w:r>
+              <w:rPr>
+                <w:sz w:val="16"/>
+                <w:szCs w:val="16"/>
+                <w:lang w:val="en-US"/>
+              </w:rPr>
+              <w:t>signature;role</w:t>
+            </w:r>
+            <w:proofErr w:type="gramEnd"/>
+            <w:r>
+              <w:rPr>
+                <w:sz w:val="16"/>
+                <w:szCs w:val="16"/>
+                <w:lang w:val="en-US"/>
+              </w:rPr>
+              <w:t>=</w:t>
+            </w:r>
+            <w:proofErr w:type="gramStart"/>
+            <w:r>
+              <w:rPr>
+                <w:sz w:val="16"/>
+                <w:szCs w:val="16"/>
+                <w:lang w:val="en-US"/>
+              </w:rPr>
+              <w:t>Pemohon;required</w:t>
+            </w:r>
+            <w:proofErr w:type="gramEnd"/>
+            <w:r>
+              <w:rPr>
+                <w:sz w:val="16"/>
+                <w:szCs w:val="16"/>
+                <w:lang w:val="en-US"/>
+              </w:rPr>
+              <w:t>=true}}</w:t>
+            </w:r>
+          </w:p>
+        </w:tc>
+        <w:tc>
+          <w:tcPr>
+            <w:tcW w:w="4960" w:type="dxa"/>
+            <w:tcBorders>
+              <w:top w:val="none" w:sz="0" w:space="0" w:color="FFFFFF"/>
+              <w:left w:val="none" w:sz="0" w:space="0" w:color="FFFFFF"/>
+              <w:bottom w:val="none" w:sz="0" w:space="0" w:color="FFFFFF"/>
+              <w:right w:val="none" w:sz="0" w:space="0" w:color="FFFFFF"/>
+            </w:tcBorders>
+            <w:tcMar>
+              <w:top w:w="40" w:type="dxa"/>
+              <w:left w:w="80" w:type="dxa"/>
+              <w:bottom w:w="40" w:type="dxa"/>
+              <w:right w:w="80" w:type="dxa"/>
+            </w:tcMar>
+          </w:tcPr>
           <w:p>
             <w:pPr>
               <w:spacing w:before="60" w:after="60"/>
               <w:jc w:val="center"/>
+              <w:rPr>
+                <w:sz w:val="16"/>
+                <w:szCs w:val="16"/>
+              </w:rPr>
             </w:pPr>
             <w:r>
               <w:rPr>
+                <w:sz w:val="16"/>
+                <w:szCs w:val="16"/>
                 <w:lang w:val="en-US"/>
               </w:rPr>
               <w:t>{{</w:t>
@@ -2267,13 +2384,25 @@
             <w:proofErr w:type="gramStart"/>
             <w:r>
               <w:rPr>
-                <w:lang w:val="en-US"/>
-              </w:rPr>
-              <w:t>SignPemohon;type</w:t>
-            </w:r>
-            <w:proofErr w:type="gramEnd"/>
-            <w:r>
-              <w:rPr>
+                <w:sz w:val="16"/>
+                <w:szCs w:val="16"/>
+                <w:lang w:val="en-US"/>
+              </w:rPr>
+              <w:t>XP</w:t>
+            </w:r>
+            <w:r>
+              <w:rPr>
+                <w:sz w:val="16"/>
+                <w:szCs w:val="16"/>
+                <w:lang w:val="en-US"/>
+              </w:rPr>
+              <w:t>;type</w:t>
+            </w:r>
+            <w:proofErr w:type="gramEnd"/>
+            <w:r>
+              <w:rPr>
+                <w:sz w:val="16"/>
+                <w:szCs w:val="16"/>
                 <w:lang w:val="en-US"/>
               </w:rPr>
               <w:t>=</w:t>
@@ -2281,6 +2410,8 @@
             <w:proofErr w:type="gramStart"/>
             <w:r>
               <w:rPr>
+                <w:sz w:val="16"/>
+                <w:szCs w:val="16"/>
                 <w:lang w:val="en-US"/>
               </w:rPr>
               <w:t>signature;role</w:t>
@@ -2288,6 +2419,8 @@
             <w:proofErr w:type="gramEnd"/>
             <w:r>
               <w:rPr>
+                <w:sz w:val="16"/>
+                <w:szCs w:val="16"/>
                 <w:lang w:val="en-US"/>
               </w:rPr>
               <w:t>=</w:t>
@@ -2295,86 +2428,8 @@
             <w:proofErr w:type="gramStart"/>
             <w:r>
               <w:rPr>
-                <w:lang w:val="en-US"/>
-              </w:rPr>
-              <w:t>Pemohon;required</w:t>
-            </w:r>
-            <w:proofErr w:type="gramEnd"/>
-            <w:r>
-              <w:rPr>
-                <w:lang w:val="en-US"/>
-              </w:rPr>
-              <w:t>=true}}</w:t>
-            </w:r>
-          </w:p>
-        </w:tc>
-        <w:tc>
-          <w:tcPr>
-            <w:tcW w:w="4960" w:type="dxa"/>
-            <w:tcBorders>
-              <w:top w:val="none" w:sz="0" w:space="0" w:color="FFFFFF"/>
-              <w:left w:val="none" w:sz="0" w:space="0" w:color="FFFFFF"/>
-              <w:bottom w:val="none" w:sz="0" w:space="0" w:color="FFFFFF"/>
-              <w:right w:val="none" w:sz="0" w:space="0" w:color="FFFFFF"/>
-            </w:tcBorders>
-            <w:tcMar>
-              <w:top w:w="40" w:type="dxa"/>
-              <w:left w:w="80" w:type="dxa"/>
-              <w:bottom w:w="40" w:type="dxa"/>
-              <w:right w:w="80" w:type="dxa"/>
-            </w:tcMar>
-          </w:tcPr>
-          <w:p>
-            <w:pPr>
-              <w:spacing w:before="60" w:after="60"/>
-              <w:jc w:val="center"/>
-              <w:rPr>
-                <w:lang w:val="en-US"/>
-              </w:rPr>
-            </w:pPr>
-          </w:p>
-          <w:p>
-            <w:pPr>
-              <w:spacing w:before="60" w:after="60"/>
-              <w:jc w:val="center"/>
-            </w:pPr>
-            <w:r>
-              <w:rPr>
-                <w:lang w:val="en-US"/>
-              </w:rPr>
-              <w:t>{{</w:t>
-            </w:r>
-            <w:proofErr w:type="gramStart"/>
-            <w:r>
-              <w:rPr>
-                <w:lang w:val="en-US"/>
-              </w:rPr>
-              <w:t>SignPetugas;type</w:t>
-            </w:r>
-            <w:proofErr w:type="gramEnd"/>
-            <w:r>
-              <w:rPr>
-                <w:lang w:val="en-US"/>
-              </w:rPr>
-              <w:t>=</w:t>
-            </w:r>
-            <w:proofErr w:type="gramStart"/>
-            <w:r>
-              <w:rPr>
-                <w:lang w:val="en-US"/>
-              </w:rPr>
-              <w:t>signature;role</w:t>
-            </w:r>
-            <w:proofErr w:type="gramEnd"/>
-            <w:r>
-              <w:rPr>
-                <w:lang w:val="en-US"/>
-              </w:rPr>
-              <w:t>=</w:t>
-            </w:r>
-            <w:proofErr w:type="gramStart"/>
-            <w:r>
-              <w:rPr>
+                <w:sz w:val="16"/>
+                <w:szCs w:val="16"/>
                 <w:lang w:val="en-US"/>
               </w:rPr>
               <w:t>Petugas;required</w:t>
@@ -2382,9 +2437,27 @@
             <w:proofErr w:type="gramEnd"/>
             <w:r>
               <w:rPr>
-                <w:lang w:val="en-US"/>
-              </w:rPr>
-              <w:t>=true}}</w:t>
+                <w:sz w:val="16"/>
+                <w:szCs w:val="16"/>
+                <w:lang w:val="en-US"/>
+              </w:rPr>
+              <w:t>=true</w:t>
+            </w:r>
+            <w:r>
+              <w:rPr>
+                <w:sz w:val="16"/>
+                <w:szCs w:val="16"/>
+                <w:lang w:val="en-US"/>
+              </w:rPr>
+              <w:t xml:space="preserve"> </w:t>
+            </w:r>
+            <w:r>
+              <w:rPr>
+                <w:sz w:val="16"/>
+                <w:szCs w:val="16"/>
+                <w:lang w:val="en-US"/>
+              </w:rPr>
+              <w:t>}}</w:t>
             </w:r>
           </w:p>
         </w:tc>
@@ -3543,7 +3616,7 @@
 </file>
 
 <file path=customXml/itemProps1.xml><?xml version="1.0" encoding="utf-8"?>
-<ds:datastoreItem xmlns:ds="http://schemas.openxmlformats.org/officeDocument/2006/customXml" ds:itemID="{60DDFB1F-5E64-1546-9DF5-4A99860E9FF8}">
+<ds:datastoreItem xmlns:ds="http://schemas.openxmlformats.org/officeDocument/2006/customXml" ds:itemID="{E0F8C72A-2DF2-694C-B2DC-E98EF3E377D0}">
   <ds:schemaRefs>
     <ds:schemaRef ds:uri="http://schemas.openxmlformats.org/officeDocument/2006/bibliography"/>
   </ds:schemaRefs>

</xml_diff>